<commit_message>
docs: fix collapsed table columns in the manuscript revision document
The two summary tables declared column widths as percentages only, so Word
and Google Docs applied autofit and collapsed the middle column to roughly
one character per line, which made the whole document unreadable.

- Declare widths in absolute twips on the table, the grid and every cell,
  and set tblLayout to fixed, so autofit cannot re-decide the columns.
  Grid now sums exactly to the 9360-twip text width.
- Widen the "#" column from 4% to 7% so two-digit numbers do not wrap.
- Rebuild the twelve instruction banners as bordered, shaded paragraphs
  instead of single-cell tables. They were decorative, and a table is a
  needless place for autofit to go wrong. Table count drops 14 -> 2.

Text content is unchanged: 9,678 words, 11 replacement blocks, no parse
warnings.

Co-Authored-By: Claude Opus 5 <noreply@anthropic.com>
Claude-Session: https://claude.ai/code/session_01KJCBhwXyDj1kaiQWF9G7ZP
</commit_message>
<xml_diff>
--- a/05_Website_Angular/docs/ResumeMatch-PH-Updated-Manuscript-Sections.docx
+++ b/05_Website_Angular/docs/ResumeMatch-PH-Updated-Manuscript-Sections.docx
@@ -225,7 +225,7 @@
     </w:p>
     <w:tbl>
       <w:tblPr>
-        <w:tblW w:type="pct" w:w="100%"/>
+        <w:tblW w:type="dxa" w:w="9360"/>
         <w:tblBorders>
           <w:top w:val="single" w:color="C9C2B6" w:sz="4"/>
           <w:left w:val="single" w:color="C9C2B6" w:sz="4"/>
@@ -234,11 +234,12 @@
           <w:insideH w:val="single" w:color="DDD6C9" w:sz="2"/>
           <w:insideV w:val="single" w:color="DDD6C9" w:sz="2"/>
         </w:tblBorders>
+        <w:tblLayout w:type="fixed"/>
       </w:tblPr>
       <w:tblGrid>
-        <w:gridCol w:w="100"/>
-        <w:gridCol w:w="100"/>
-        <w:gridCol w:w="100"/>
+        <w:gridCol w:w="655"/>
+        <w:gridCol w:w="3838"/>
+        <w:gridCol w:w="4867"/>
       </w:tblGrid>
       <w:tr>
         <w:trPr>
@@ -246,7 +247,7 @@
         </w:trPr>
         <w:tc>
           <w:tcPr>
-            <w:tcW w:type="pct" w:w="4%"/>
+            <w:tcW w:type="dxa" w:w="655"/>
             <w:shd w:fill="F2EFE9" w:val="clear"/>
             <w:tcMar>
               <w:top w:type="dxa" w:w="90"/>
@@ -274,7 +275,7 @@
         </w:tc>
         <w:tc>
           <w:tcPr>
-            <w:tcW w:type="pct" w:w="42%"/>
+            <w:tcW w:type="dxa" w:w="3838"/>
             <w:shd w:fill="F2EFE9" w:val="clear"/>
             <w:tcMar>
               <w:top w:type="dxa" w:w="90"/>
@@ -302,7 +303,7 @@
         </w:tc>
         <w:tc>
           <w:tcPr>
-            <w:tcW w:type="pct" w:w="54%"/>
+            <w:tcW w:type="dxa" w:w="4867"/>
             <w:shd w:fill="F2EFE9" w:val="clear"/>
             <w:tcMar>
               <w:top w:type="dxa" w:w="90"/>
@@ -332,7 +333,7 @@
       <w:tr>
         <w:tc>
           <w:tcPr>
-            <w:tcW w:type="pct" w:w="4%"/>
+            <w:tcW w:type="dxa" w:w="655"/>
             <w:tcMar>
               <w:top w:type="dxa" w:w="90"/>
               <w:left w:type="dxa" w:w="120"/>
@@ -359,7 +360,7 @@
         </w:tc>
         <w:tc>
           <w:tcPr>
-            <w:tcW w:type="pct" w:w="42%"/>
+            <w:tcW w:type="dxa" w:w="3838"/>
             <w:tcMar>
               <w:top w:type="dxa" w:w="90"/>
               <w:left w:type="dxa" w:w="120"/>
@@ -386,7 +387,7 @@
         </w:tc>
         <w:tc>
           <w:tcPr>
-            <w:tcW w:type="pct" w:w="54%"/>
+            <w:tcW w:type="dxa" w:w="4867"/>
             <w:tcMar>
               <w:top w:type="dxa" w:w="90"/>
               <w:left w:type="dxa" w:w="120"/>
@@ -415,7 +416,7 @@
       <w:tr>
         <w:tc>
           <w:tcPr>
-            <w:tcW w:type="pct" w:w="4%"/>
+            <w:tcW w:type="dxa" w:w="655"/>
             <w:tcMar>
               <w:top w:type="dxa" w:w="90"/>
               <w:left w:type="dxa" w:w="120"/>
@@ -442,7 +443,7 @@
         </w:tc>
         <w:tc>
           <w:tcPr>
-            <w:tcW w:type="pct" w:w="42%"/>
+            <w:tcW w:type="dxa" w:w="3838"/>
             <w:tcMar>
               <w:top w:type="dxa" w:w="90"/>
               <w:left w:type="dxa" w:w="120"/>
@@ -469,7 +470,7 @@
         </w:tc>
         <w:tc>
           <w:tcPr>
-            <w:tcW w:type="pct" w:w="54%"/>
+            <w:tcW w:type="dxa" w:w="4867"/>
             <w:tcMar>
               <w:top w:type="dxa" w:w="90"/>
               <w:left w:type="dxa" w:w="120"/>
@@ -498,7 +499,7 @@
       <w:tr>
         <w:tc>
           <w:tcPr>
-            <w:tcW w:type="pct" w:w="4%"/>
+            <w:tcW w:type="dxa" w:w="655"/>
             <w:tcMar>
               <w:top w:type="dxa" w:w="90"/>
               <w:left w:type="dxa" w:w="120"/>
@@ -525,7 +526,7 @@
         </w:tc>
         <w:tc>
           <w:tcPr>
-            <w:tcW w:type="pct" w:w="42%"/>
+            <w:tcW w:type="dxa" w:w="3838"/>
             <w:tcMar>
               <w:top w:type="dxa" w:w="90"/>
               <w:left w:type="dxa" w:w="120"/>
@@ -552,7 +553,7 @@
         </w:tc>
         <w:tc>
           <w:tcPr>
-            <w:tcW w:type="pct" w:w="54%"/>
+            <w:tcW w:type="dxa" w:w="4867"/>
             <w:tcMar>
               <w:top w:type="dxa" w:w="90"/>
               <w:left w:type="dxa" w:w="120"/>
@@ -581,7 +582,7 @@
       <w:tr>
         <w:tc>
           <w:tcPr>
-            <w:tcW w:type="pct" w:w="4%"/>
+            <w:tcW w:type="dxa" w:w="655"/>
             <w:tcMar>
               <w:top w:type="dxa" w:w="90"/>
               <w:left w:type="dxa" w:w="120"/>
@@ -608,7 +609,7 @@
         </w:tc>
         <w:tc>
           <w:tcPr>
-            <w:tcW w:type="pct" w:w="42%"/>
+            <w:tcW w:type="dxa" w:w="3838"/>
             <w:tcMar>
               <w:top w:type="dxa" w:w="90"/>
               <w:left w:type="dxa" w:w="120"/>
@@ -635,7 +636,7 @@
         </w:tc>
         <w:tc>
           <w:tcPr>
-            <w:tcW w:type="pct" w:w="54%"/>
+            <w:tcW w:type="dxa" w:w="4867"/>
             <w:tcMar>
               <w:top w:type="dxa" w:w="90"/>
               <w:left w:type="dxa" w:w="120"/>
@@ -664,7 +665,7 @@
       <w:tr>
         <w:tc>
           <w:tcPr>
-            <w:tcW w:type="pct" w:w="4%"/>
+            <w:tcW w:type="dxa" w:w="655"/>
             <w:tcMar>
               <w:top w:type="dxa" w:w="90"/>
               <w:left w:type="dxa" w:w="120"/>
@@ -691,7 +692,7 @@
         </w:tc>
         <w:tc>
           <w:tcPr>
-            <w:tcW w:type="pct" w:w="42%"/>
+            <w:tcW w:type="dxa" w:w="3838"/>
             <w:tcMar>
               <w:top w:type="dxa" w:w="90"/>
               <w:left w:type="dxa" w:w="120"/>
@@ -718,7 +719,7 @@
         </w:tc>
         <w:tc>
           <w:tcPr>
-            <w:tcW w:type="pct" w:w="54%"/>
+            <w:tcW w:type="dxa" w:w="4867"/>
             <w:tcMar>
               <w:top w:type="dxa" w:w="90"/>
               <w:left w:type="dxa" w:w="120"/>
@@ -747,7 +748,7 @@
       <w:tr>
         <w:tc>
           <w:tcPr>
-            <w:tcW w:type="pct" w:w="4%"/>
+            <w:tcW w:type="dxa" w:w="655"/>
             <w:tcMar>
               <w:top w:type="dxa" w:w="90"/>
               <w:left w:type="dxa" w:w="120"/>
@@ -774,7 +775,7 @@
         </w:tc>
         <w:tc>
           <w:tcPr>
-            <w:tcW w:type="pct" w:w="42%"/>
+            <w:tcW w:type="dxa" w:w="3838"/>
             <w:tcMar>
               <w:top w:type="dxa" w:w="90"/>
               <w:left w:type="dxa" w:w="120"/>
@@ -801,7 +802,7 @@
         </w:tc>
         <w:tc>
           <w:tcPr>
-            <w:tcW w:type="pct" w:w="54%"/>
+            <w:tcW w:type="dxa" w:w="4867"/>
             <w:tcMar>
               <w:top w:type="dxa" w:w="90"/>
               <w:left w:type="dxa" w:w="120"/>
@@ -830,7 +831,7 @@
       <w:tr>
         <w:tc>
           <w:tcPr>
-            <w:tcW w:type="pct" w:w="4%"/>
+            <w:tcW w:type="dxa" w:w="655"/>
             <w:tcMar>
               <w:top w:type="dxa" w:w="90"/>
               <w:left w:type="dxa" w:w="120"/>
@@ -857,7 +858,7 @@
         </w:tc>
         <w:tc>
           <w:tcPr>
-            <w:tcW w:type="pct" w:w="42%"/>
+            <w:tcW w:type="dxa" w:w="3838"/>
             <w:tcMar>
               <w:top w:type="dxa" w:w="90"/>
               <w:left w:type="dxa" w:w="120"/>
@@ -884,7 +885,7 @@
         </w:tc>
         <w:tc>
           <w:tcPr>
-            <w:tcW w:type="pct" w:w="54%"/>
+            <w:tcW w:type="dxa" w:w="4867"/>
             <w:tcMar>
               <w:top w:type="dxa" w:w="90"/>
               <w:left w:type="dxa" w:w="120"/>
@@ -913,7 +914,7 @@
       <w:tr>
         <w:tc>
           <w:tcPr>
-            <w:tcW w:type="pct" w:w="4%"/>
+            <w:tcW w:type="dxa" w:w="655"/>
             <w:tcMar>
               <w:top w:type="dxa" w:w="90"/>
               <w:left w:type="dxa" w:w="120"/>
@@ -940,7 +941,7 @@
         </w:tc>
         <w:tc>
           <w:tcPr>
-            <w:tcW w:type="pct" w:w="42%"/>
+            <w:tcW w:type="dxa" w:w="3838"/>
             <w:tcMar>
               <w:top w:type="dxa" w:w="90"/>
               <w:left w:type="dxa" w:w="120"/>
@@ -967,7 +968,7 @@
         </w:tc>
         <w:tc>
           <w:tcPr>
-            <w:tcW w:type="pct" w:w="54%"/>
+            <w:tcW w:type="dxa" w:w="4867"/>
             <w:tcMar>
               <w:top w:type="dxa" w:w="90"/>
               <w:left w:type="dxa" w:w="120"/>
@@ -996,7 +997,7 @@
       <w:tr>
         <w:tc>
           <w:tcPr>
-            <w:tcW w:type="pct" w:w="4%"/>
+            <w:tcW w:type="dxa" w:w="655"/>
             <w:tcMar>
               <w:top w:type="dxa" w:w="90"/>
               <w:left w:type="dxa" w:w="120"/>
@@ -1023,7 +1024,7 @@
         </w:tc>
         <w:tc>
           <w:tcPr>
-            <w:tcW w:type="pct" w:w="42%"/>
+            <w:tcW w:type="dxa" w:w="3838"/>
             <w:tcMar>
               <w:top w:type="dxa" w:w="90"/>
               <w:left w:type="dxa" w:w="120"/>
@@ -1050,7 +1051,7 @@
         </w:tc>
         <w:tc>
           <w:tcPr>
-            <w:tcW w:type="pct" w:w="54%"/>
+            <w:tcW w:type="dxa" w:w="4867"/>
             <w:tcMar>
               <w:top w:type="dxa" w:w="90"/>
               <w:left w:type="dxa" w:w="120"/>
@@ -1079,7 +1080,7 @@
       <w:tr>
         <w:tc>
           <w:tcPr>
-            <w:tcW w:type="pct" w:w="4%"/>
+            <w:tcW w:type="dxa" w:w="655"/>
             <w:tcMar>
               <w:top w:type="dxa" w:w="90"/>
               <w:left w:type="dxa" w:w="120"/>
@@ -1106,7 +1107,7 @@
         </w:tc>
         <w:tc>
           <w:tcPr>
-            <w:tcW w:type="pct" w:w="42%"/>
+            <w:tcW w:type="dxa" w:w="3838"/>
             <w:tcMar>
               <w:top w:type="dxa" w:w="90"/>
               <w:left w:type="dxa" w:w="120"/>
@@ -1133,7 +1134,7 @@
         </w:tc>
         <w:tc>
           <w:tcPr>
-            <w:tcW w:type="pct" w:w="54%"/>
+            <w:tcW w:type="dxa" w:w="4867"/>
             <w:tcMar>
               <w:top w:type="dxa" w:w="90"/>
               <w:left w:type="dxa" w:w="120"/>
@@ -1162,7 +1163,7 @@
       <w:tr>
         <w:tc>
           <w:tcPr>
-            <w:tcW w:type="pct" w:w="4%"/>
+            <w:tcW w:type="dxa" w:w="655"/>
             <w:tcMar>
               <w:top w:type="dxa" w:w="90"/>
               <w:left w:type="dxa" w:w="120"/>
@@ -1189,7 +1190,7 @@
         </w:tc>
         <w:tc>
           <w:tcPr>
-            <w:tcW w:type="pct" w:w="42%"/>
+            <w:tcW w:type="dxa" w:w="3838"/>
             <w:tcMar>
               <w:top w:type="dxa" w:w="90"/>
               <w:left w:type="dxa" w:w="120"/>
@@ -1216,7 +1217,7 @@
         </w:tc>
         <w:tc>
           <w:tcPr>
-            <w:tcW w:type="pct" w:w="54%"/>
+            <w:tcW w:type="dxa" w:w="4867"/>
             <w:tcMar>
               <w:top w:type="dxa" w:w="90"/>
               <w:left w:type="dxa" w:w="120"/>
@@ -1248,62 +1249,42 @@
         <w:br w:type="page"/>
       </w:r>
     </w:p>
-    <w:tbl>
-      <w:tblPr>
-        <w:tblW w:type="pct" w:w="100%"/>
-        <w:tblBorders>
-          <w:top w:val="single" w:color="8C2A2A" w:sz="12"/>
-          <w:left w:val="single" w:color="8C2A2A" w:sz="12"/>
-          <w:bottom w:val="single" w:color="8C2A2A" w:sz="12"/>
-          <w:right w:val="single" w:color="8C2A2A" w:sz="12"/>
-          <w:insideH w:val="none" w:color="FFFFFF" w:sz="0"/>
-          <w:insideV w:val="none" w:color="FFFFFF" w:sz="0"/>
-        </w:tblBorders>
-      </w:tblPr>
-      <w:tblGrid>
-        <w:gridCol w:w="100"/>
-      </w:tblGrid>
-      <w:tr>
-        <w:tc>
-          <w:tcPr>
-            <w:shd w:fill="F2EFE9" w:val="clear"/>
-            <w:tcMar>
-              <w:top w:type="dxa" w:w="140"/>
-              <w:left w:type="dxa" w:w="160"/>
-              <w:bottom w:type="dxa" w:w="140"/>
-              <w:right w:type="dxa" w:w="160"/>
-            </w:tcMar>
-          </w:tcPr>
-          <w:p>
-            <w:pPr>
-              <w:spacing w:after="40"/>
-            </w:pPr>
-            <w:r>
-              <w:rPr>
-                <w:rFonts w:ascii="Arial" w:cs="Arial" w:eastAsia="Arial" w:hAnsi="Arial"/>
-                <w:b/>
-                <w:bCs/>
-                <w:color w:val="8C2A2A"/>
-                <w:sz w:val="22"/>
-                <w:szCs w:val="22"/>
-              </w:rPr>
-              <w:t xml:space="preserve">REPLACEMENT 1 — Introduction</w:t>
-            </w:r>
-          </w:p>
-          <w:p>
-            <w:r>
-              <w:rPr>
-                <w:rFonts w:ascii="Arial" w:cs="Arial" w:eastAsia="Arial" w:hAnsi="Arial"/>
-                <w:color w:val="6B6B6B"/>
-                <w:sz w:val="18"/>
-                <w:szCs w:val="18"/>
-              </w:rPr>
-              <w:t xml:space="preserve">Replace the entire Introduction section (pages 6–9 of the current PDF), from the heading "Introduction" to the end of the paragraph ending "…identify the most suitable candidates."</w:t>
-            </w:r>
-          </w:p>
-        </w:tc>
-      </w:tr>
-    </w:tbl>
+    <w:p>
+      <w:pPr>
+        <w:pBdr>
+          <w:top w:val="single" w:color="8C2A2A" w:sz="12" w:space="8"/>
+          <w:bottom w:val="single" w:color="8C2A2A" w:sz="12" w:space="8"/>
+          <w:left w:val="single" w:color="8C2A2A" w:sz="12" w:space="8"/>
+          <w:right w:val="single" w:color="8C2A2A" w:sz="12" w:space="8"/>
+        </w:pBdr>
+        <w:shd w:fill="F2EFE9" w:val="clear"/>
+        <w:spacing w:after="0" w:before="240" w:line="300"/>
+        <w:ind w:left="120" w:right="120"/>
+      </w:pPr>
+      <w:r>
+        <w:rPr>
+          <w:rFonts w:ascii="Arial" w:cs="Arial" w:eastAsia="Arial" w:hAnsi="Arial"/>
+          <w:b/>
+          <w:bCs/>
+          <w:color w:val="8C2A2A"/>
+          <w:sz w:val="22"/>
+          <w:szCs w:val="22"/>
+        </w:rPr>
+        <w:t xml:space="preserve">REPLACEMENT 1 — Introduction</w:t>
+      </w:r>
+      <w:r>
+        <w:br/>
+      </w:r>
+      <w:r>
+        <w:rPr>
+          <w:rFonts w:ascii="Arial" w:cs="Arial" w:eastAsia="Arial" w:hAnsi="Arial"/>
+          <w:color w:val="6B6B6B"/>
+          <w:sz w:val="18"/>
+          <w:szCs w:val="18"/>
+        </w:rPr>
+        <w:t xml:space="preserve">Replace the entire Introduction section (pages 6–9 of the current PDF), from the heading "Introduction" to the end of the paragraph ending "…identify the most suitable candidates."</w:t>
+      </w:r>
+    </w:p>
     <w:p>
       <w:pPr>
         <w:spacing w:after="140" w:before="140" w:line="280"/>
@@ -1519,62 +1500,42 @@
         <w:br w:type="page"/>
       </w:r>
     </w:p>
-    <w:tbl>
-      <w:tblPr>
-        <w:tblW w:type="pct" w:w="100%"/>
-        <w:tblBorders>
-          <w:top w:val="single" w:color="8C2A2A" w:sz="12"/>
-          <w:left w:val="single" w:color="8C2A2A" w:sz="12"/>
-          <w:bottom w:val="single" w:color="8C2A2A" w:sz="12"/>
-          <w:right w:val="single" w:color="8C2A2A" w:sz="12"/>
-          <w:insideH w:val="none" w:color="FFFFFF" w:sz="0"/>
-          <w:insideV w:val="none" w:color="FFFFFF" w:sz="0"/>
-        </w:tblBorders>
-      </w:tblPr>
-      <w:tblGrid>
-        <w:gridCol w:w="100"/>
-      </w:tblGrid>
-      <w:tr>
-        <w:tc>
-          <w:tcPr>
-            <w:shd w:fill="F2EFE9" w:val="clear"/>
-            <w:tcMar>
-              <w:top w:type="dxa" w:w="140"/>
-              <w:left w:type="dxa" w:w="160"/>
-              <w:bottom w:type="dxa" w:w="140"/>
-              <w:right w:type="dxa" w:w="160"/>
-            </w:tcMar>
-          </w:tcPr>
-          <w:p>
-            <w:pPr>
-              <w:spacing w:after="40"/>
-            </w:pPr>
-            <w:r>
-              <w:rPr>
-                <w:rFonts w:ascii="Arial" w:cs="Arial" w:eastAsia="Arial" w:hAnsi="Arial"/>
-                <w:b/>
-                <w:bCs/>
-                <w:color w:val="8C2A2A"/>
-                <w:sz w:val="22"/>
-                <w:szCs w:val="22"/>
-              </w:rPr>
-              <w:t xml:space="preserve">REPLACEMENT 2 — Conceptual Framework</w:t>
-            </w:r>
-          </w:p>
-          <w:p>
-            <w:r>
-              <w:rPr>
-                <w:rFonts w:ascii="Arial" w:cs="Arial" w:eastAsia="Arial" w:hAnsi="Arial"/>
-                <w:color w:val="6B6B6B"/>
-                <w:sz w:val="18"/>
-                <w:szCs w:val="18"/>
-              </w:rPr>
-              <w:t xml:space="preserve">Replace the entire Conceptual Framework section (pages 25–28), from the heading "Conceptual Framework" through the Figure 1 caption.</w:t>
-            </w:r>
-          </w:p>
-        </w:tc>
-      </w:tr>
-    </w:tbl>
+    <w:p>
+      <w:pPr>
+        <w:pBdr>
+          <w:top w:val="single" w:color="8C2A2A" w:sz="12" w:space="8"/>
+          <w:bottom w:val="single" w:color="8C2A2A" w:sz="12" w:space="8"/>
+          <w:left w:val="single" w:color="8C2A2A" w:sz="12" w:space="8"/>
+          <w:right w:val="single" w:color="8C2A2A" w:sz="12" w:space="8"/>
+        </w:pBdr>
+        <w:shd w:fill="F2EFE9" w:val="clear"/>
+        <w:spacing w:after="0" w:before="240" w:line="300"/>
+        <w:ind w:left="120" w:right="120"/>
+      </w:pPr>
+      <w:r>
+        <w:rPr>
+          <w:rFonts w:ascii="Arial" w:cs="Arial" w:eastAsia="Arial" w:hAnsi="Arial"/>
+          <w:b/>
+          <w:bCs/>
+          <w:color w:val="8C2A2A"/>
+          <w:sz w:val="22"/>
+          <w:szCs w:val="22"/>
+        </w:rPr>
+        <w:t xml:space="preserve">REPLACEMENT 2 — Conceptual Framework</w:t>
+      </w:r>
+      <w:r>
+        <w:br/>
+      </w:r>
+      <w:r>
+        <w:rPr>
+          <w:rFonts w:ascii="Arial" w:cs="Arial" w:eastAsia="Arial" w:hAnsi="Arial"/>
+          <w:color w:val="6B6B6B"/>
+          <w:sz w:val="18"/>
+          <w:szCs w:val="18"/>
+        </w:rPr>
+        <w:t xml:space="preserve">Replace the entire Conceptual Framework section (pages 25–28), from the heading "Conceptual Framework" through the Figure 1 caption.</w:t>
+      </w:r>
+    </w:p>
     <w:p>
       <w:pPr>
         <w:spacing w:after="140" w:before="140" w:line="280"/>
@@ -1764,62 +1725,42 @@
         <w:br w:type="page"/>
       </w:r>
     </w:p>
-    <w:tbl>
-      <w:tblPr>
-        <w:tblW w:type="pct" w:w="100%"/>
-        <w:tblBorders>
-          <w:top w:val="single" w:color="8C2A2A" w:sz="12"/>
-          <w:left w:val="single" w:color="8C2A2A" w:sz="12"/>
-          <w:bottom w:val="single" w:color="8C2A2A" w:sz="12"/>
-          <w:right w:val="single" w:color="8C2A2A" w:sz="12"/>
-          <w:insideH w:val="none" w:color="FFFFFF" w:sz="0"/>
-          <w:insideV w:val="none" w:color="FFFFFF" w:sz="0"/>
-        </w:tblBorders>
-      </w:tblPr>
-      <w:tblGrid>
-        <w:gridCol w:w="100"/>
-      </w:tblGrid>
-      <w:tr>
-        <w:tc>
-          <w:tcPr>
-            <w:shd w:fill="F2EFE9" w:val="clear"/>
-            <w:tcMar>
-              <w:top w:type="dxa" w:w="140"/>
-              <w:left w:type="dxa" w:w="160"/>
-              <w:bottom w:type="dxa" w:w="140"/>
-              <w:right w:type="dxa" w:w="160"/>
-            </w:tcMar>
-          </w:tcPr>
-          <w:p>
-            <w:pPr>
-              <w:spacing w:after="40"/>
-            </w:pPr>
-            <w:r>
-              <w:rPr>
-                <w:rFonts w:ascii="Arial" w:cs="Arial" w:eastAsia="Arial" w:hAnsi="Arial"/>
-                <w:b/>
-                <w:bCs/>
-                <w:color w:val="8C2A2A"/>
-                <w:sz w:val="22"/>
-                <w:szCs w:val="22"/>
-              </w:rPr>
-              <w:t xml:space="preserve">REPLACEMENT 3 — Objectives of the Study</w:t>
-            </w:r>
-          </w:p>
-          <w:p>
-            <w:r>
-              <w:rPr>
-                <w:rFonts w:ascii="Arial" w:cs="Arial" w:eastAsia="Arial" w:hAnsi="Arial"/>
-                <w:color w:val="6B6B6B"/>
-                <w:sz w:val="18"/>
-                <w:szCs w:val="18"/>
-              </w:rPr>
-              <w:t xml:space="preserve">Replace the entire Objectives of the Study section (pages 27–30), including the numbered list.</w:t>
-            </w:r>
-          </w:p>
-        </w:tc>
-      </w:tr>
-    </w:tbl>
+    <w:p>
+      <w:pPr>
+        <w:pBdr>
+          <w:top w:val="single" w:color="8C2A2A" w:sz="12" w:space="8"/>
+          <w:bottom w:val="single" w:color="8C2A2A" w:sz="12" w:space="8"/>
+          <w:left w:val="single" w:color="8C2A2A" w:sz="12" w:space="8"/>
+          <w:right w:val="single" w:color="8C2A2A" w:sz="12" w:space="8"/>
+        </w:pBdr>
+        <w:shd w:fill="F2EFE9" w:val="clear"/>
+        <w:spacing w:after="0" w:before="240" w:line="300"/>
+        <w:ind w:left="120" w:right="120"/>
+      </w:pPr>
+      <w:r>
+        <w:rPr>
+          <w:rFonts w:ascii="Arial" w:cs="Arial" w:eastAsia="Arial" w:hAnsi="Arial"/>
+          <w:b/>
+          <w:bCs/>
+          <w:color w:val="8C2A2A"/>
+          <w:sz w:val="22"/>
+          <w:szCs w:val="22"/>
+        </w:rPr>
+        <w:t xml:space="preserve">REPLACEMENT 3 — Objectives of the Study</w:t>
+      </w:r>
+      <w:r>
+        <w:br/>
+      </w:r>
+      <w:r>
+        <w:rPr>
+          <w:rFonts w:ascii="Arial" w:cs="Arial" w:eastAsia="Arial" w:hAnsi="Arial"/>
+          <w:color w:val="6B6B6B"/>
+          <w:sz w:val="18"/>
+          <w:szCs w:val="18"/>
+        </w:rPr>
+        <w:t xml:space="preserve">Replace the entire Objectives of the Study section (pages 27–30), including the numbered list.</w:t>
+      </w:r>
+    </w:p>
     <w:p>
       <w:pPr>
         <w:spacing w:after="140" w:before="140" w:line="280"/>
@@ -2119,62 +2060,42 @@
         <w:br w:type="page"/>
       </w:r>
     </w:p>
-    <w:tbl>
-      <w:tblPr>
-        <w:tblW w:type="pct" w:w="100%"/>
-        <w:tblBorders>
-          <w:top w:val="single" w:color="8C2A2A" w:sz="12"/>
-          <w:left w:val="single" w:color="8C2A2A" w:sz="12"/>
-          <w:bottom w:val="single" w:color="8C2A2A" w:sz="12"/>
-          <w:right w:val="single" w:color="8C2A2A" w:sz="12"/>
-          <w:insideH w:val="none" w:color="FFFFFF" w:sz="0"/>
-          <w:insideV w:val="none" w:color="FFFFFF" w:sz="0"/>
-        </w:tblBorders>
-      </w:tblPr>
-      <w:tblGrid>
-        <w:gridCol w:w="100"/>
-      </w:tblGrid>
-      <w:tr>
-        <w:tc>
-          <w:tcPr>
-            <w:shd w:fill="F2EFE9" w:val="clear"/>
-            <w:tcMar>
-              <w:top w:type="dxa" w:w="140"/>
-              <w:left w:type="dxa" w:w="160"/>
-              <w:bottom w:type="dxa" w:w="140"/>
-              <w:right w:type="dxa" w:w="160"/>
-            </w:tcMar>
-          </w:tcPr>
-          <w:p>
-            <w:pPr>
-              <w:spacing w:after="40"/>
-            </w:pPr>
-            <w:r>
-              <w:rPr>
-                <w:rFonts w:ascii="Arial" w:cs="Arial" w:eastAsia="Arial" w:hAnsi="Arial"/>
-                <w:b/>
-                <w:bCs/>
-                <w:color w:val="8C2A2A"/>
-                <w:sz w:val="22"/>
-                <w:szCs w:val="22"/>
-              </w:rPr>
-              <w:t xml:space="preserve">REPLACEMENT 4 — Scope and Delimitations</w:t>
-            </w:r>
-          </w:p>
-          <w:p>
-            <w:r>
-              <w:rPr>
-                <w:rFonts w:ascii="Arial" w:cs="Arial" w:eastAsia="Arial" w:hAnsi="Arial"/>
-                <w:color w:val="6B6B6B"/>
-                <w:sz w:val="18"/>
-                <w:szCs w:val="18"/>
-              </w:rPr>
-              <w:t xml:space="preserve">Replace the entire Scope and Delimitations section (pages 29–33), including both bullet lists.</w:t>
-            </w:r>
-          </w:p>
-        </w:tc>
-      </w:tr>
-    </w:tbl>
+    <w:p>
+      <w:pPr>
+        <w:pBdr>
+          <w:top w:val="single" w:color="8C2A2A" w:sz="12" w:space="8"/>
+          <w:bottom w:val="single" w:color="8C2A2A" w:sz="12" w:space="8"/>
+          <w:left w:val="single" w:color="8C2A2A" w:sz="12" w:space="8"/>
+          <w:right w:val="single" w:color="8C2A2A" w:sz="12" w:space="8"/>
+        </w:pBdr>
+        <w:shd w:fill="F2EFE9" w:val="clear"/>
+        <w:spacing w:after="0" w:before="240" w:line="300"/>
+        <w:ind w:left="120" w:right="120"/>
+      </w:pPr>
+      <w:r>
+        <w:rPr>
+          <w:rFonts w:ascii="Arial" w:cs="Arial" w:eastAsia="Arial" w:hAnsi="Arial"/>
+          <w:b/>
+          <w:bCs/>
+          <w:color w:val="8C2A2A"/>
+          <w:sz w:val="22"/>
+          <w:szCs w:val="22"/>
+        </w:rPr>
+        <w:t xml:space="preserve">REPLACEMENT 4 — Scope and Delimitations</w:t>
+      </w:r>
+      <w:r>
+        <w:br/>
+      </w:r>
+      <w:r>
+        <w:rPr>
+          <w:rFonts w:ascii="Arial" w:cs="Arial" w:eastAsia="Arial" w:hAnsi="Arial"/>
+          <w:color w:val="6B6B6B"/>
+          <w:sz w:val="18"/>
+          <w:szCs w:val="18"/>
+        </w:rPr>
+        <w:t xml:space="preserve">Replace the entire Scope and Delimitations section (pages 29–33), including both bullet lists.</w:t>
+      </w:r>
+    </w:p>
     <w:p>
       <w:pPr>
         <w:spacing w:after="140" w:before="140" w:line="280"/>
@@ -2850,62 +2771,42 @@
         <w:br w:type="page"/>
       </w:r>
     </w:p>
-    <w:tbl>
-      <w:tblPr>
-        <w:tblW w:type="pct" w:w="100%"/>
-        <w:tblBorders>
-          <w:top w:val="single" w:color="8C2A2A" w:sz="12"/>
-          <w:left w:val="single" w:color="8C2A2A" w:sz="12"/>
-          <w:bottom w:val="single" w:color="8C2A2A" w:sz="12"/>
-          <w:right w:val="single" w:color="8C2A2A" w:sz="12"/>
-          <w:insideH w:val="none" w:color="FFFFFF" w:sz="0"/>
-          <w:insideV w:val="none" w:color="FFFFFF" w:sz="0"/>
-        </w:tblBorders>
-      </w:tblPr>
-      <w:tblGrid>
-        <w:gridCol w:w="100"/>
-      </w:tblGrid>
-      <w:tr>
-        <w:tc>
-          <w:tcPr>
-            <w:shd w:fill="F2EFE9" w:val="clear"/>
-            <w:tcMar>
-              <w:top w:type="dxa" w:w="140"/>
-              <w:left w:type="dxa" w:w="160"/>
-              <w:bottom w:type="dxa" w:w="140"/>
-              <w:right w:type="dxa" w:w="160"/>
-            </w:tcMar>
-          </w:tcPr>
-          <w:p>
-            <w:pPr>
-              <w:spacing w:after="40"/>
-            </w:pPr>
-            <w:r>
-              <w:rPr>
-                <w:rFonts w:ascii="Arial" w:cs="Arial" w:eastAsia="Arial" w:hAnsi="Arial"/>
-                <w:b/>
-                <w:bCs/>
-                <w:color w:val="8C2A2A"/>
-                <w:sz w:val="22"/>
-                <w:szCs w:val="22"/>
-              </w:rPr>
-              <w:t xml:space="preserve">REPLACEMENT 5 — Method (opening) and Requirement Analysis</w:t>
-            </w:r>
-          </w:p>
-          <w:p>
-            <w:r>
-              <w:rPr>
-                <w:rFonts w:ascii="Arial" w:cs="Arial" w:eastAsia="Arial" w:hAnsi="Arial"/>
-                <w:color w:val="6B6B6B"/>
-                <w:sz w:val="18"/>
-                <w:szCs w:val="18"/>
-              </w:rPr>
-              <w:t xml:space="preserve">Replace the Method opening paragraph and the whole Requirement Analysis subsection (pages 32–35).</w:t>
-            </w:r>
-          </w:p>
-        </w:tc>
-      </w:tr>
-    </w:tbl>
+    <w:p>
+      <w:pPr>
+        <w:pBdr>
+          <w:top w:val="single" w:color="8C2A2A" w:sz="12" w:space="8"/>
+          <w:bottom w:val="single" w:color="8C2A2A" w:sz="12" w:space="8"/>
+          <w:left w:val="single" w:color="8C2A2A" w:sz="12" w:space="8"/>
+          <w:right w:val="single" w:color="8C2A2A" w:sz="12" w:space="8"/>
+        </w:pBdr>
+        <w:shd w:fill="F2EFE9" w:val="clear"/>
+        <w:spacing w:after="0" w:before="240" w:line="300"/>
+        <w:ind w:left="120" w:right="120"/>
+      </w:pPr>
+      <w:r>
+        <w:rPr>
+          <w:rFonts w:ascii="Arial" w:cs="Arial" w:eastAsia="Arial" w:hAnsi="Arial"/>
+          <w:b/>
+          <w:bCs/>
+          <w:color w:val="8C2A2A"/>
+          <w:sz w:val="22"/>
+          <w:szCs w:val="22"/>
+        </w:rPr>
+        <w:t xml:space="preserve">REPLACEMENT 5 — Method (opening) and Requirement Analysis</w:t>
+      </w:r>
+      <w:r>
+        <w:br/>
+      </w:r>
+      <w:r>
+        <w:rPr>
+          <w:rFonts w:ascii="Arial" w:cs="Arial" w:eastAsia="Arial" w:hAnsi="Arial"/>
+          <w:color w:val="6B6B6B"/>
+          <w:sz w:val="18"/>
+          <w:szCs w:val="18"/>
+        </w:rPr>
+        <w:t xml:space="preserve">Replace the Method opening paragraph and the whole Requirement Analysis subsection (pages 32–35).</w:t>
+      </w:r>
+    </w:p>
     <w:p>
       <w:pPr>
         <w:spacing w:after="140" w:before="140" w:line="280"/>
@@ -3041,62 +2942,42 @@
         <w:br w:type="page"/>
       </w:r>
     </w:p>
-    <w:tbl>
-      <w:tblPr>
-        <w:tblW w:type="pct" w:w="100%"/>
-        <w:tblBorders>
-          <w:top w:val="single" w:color="8C2A2A" w:sz="12"/>
-          <w:left w:val="single" w:color="8C2A2A" w:sz="12"/>
-          <w:bottom w:val="single" w:color="8C2A2A" w:sz="12"/>
-          <w:right w:val="single" w:color="8C2A2A" w:sz="12"/>
-          <w:insideH w:val="none" w:color="FFFFFF" w:sz="0"/>
-          <w:insideV w:val="none" w:color="FFFFFF" w:sz="0"/>
-        </w:tblBorders>
-      </w:tblPr>
-      <w:tblGrid>
-        <w:gridCol w:w="100"/>
-      </w:tblGrid>
-      <w:tr>
-        <w:tc>
-          <w:tcPr>
-            <w:shd w:fill="F2EFE9" w:val="clear"/>
-            <w:tcMar>
-              <w:top w:type="dxa" w:w="140"/>
-              <w:left w:type="dxa" w:w="160"/>
-              <w:bottom w:type="dxa" w:w="140"/>
-              <w:right w:type="dxa" w:w="160"/>
-            </w:tcMar>
-          </w:tcPr>
-          <w:p>
-            <w:pPr>
-              <w:spacing w:after="40"/>
-            </w:pPr>
-            <w:r>
-              <w:rPr>
-                <w:rFonts w:ascii="Arial" w:cs="Arial" w:eastAsia="Arial" w:hAnsi="Arial"/>
-                <w:b/>
-                <w:bCs/>
-                <w:color w:val="8C2A2A"/>
-                <w:sz w:val="22"/>
-                <w:szCs w:val="22"/>
-              </w:rPr>
-              <w:t xml:space="preserve">REPLACEMENT 6 — Requirement Documentation</w:t>
-            </w:r>
-          </w:p>
-          <w:p>
-            <w:r>
-              <w:rPr>
-                <w:rFonts w:ascii="Arial" w:cs="Arial" w:eastAsia="Arial" w:hAnsi="Arial"/>
-                <w:color w:val="6B6B6B"/>
-                <w:sz w:val="18"/>
-                <w:szCs w:val="18"/>
-              </w:rPr>
-              <w:t xml:space="preserve">Replace the whole Requirement Documentation subsection (pages 34–36).</w:t>
-            </w:r>
-          </w:p>
-        </w:tc>
-      </w:tr>
-    </w:tbl>
+    <w:p>
+      <w:pPr>
+        <w:pBdr>
+          <w:top w:val="single" w:color="8C2A2A" w:sz="12" w:space="8"/>
+          <w:bottom w:val="single" w:color="8C2A2A" w:sz="12" w:space="8"/>
+          <w:left w:val="single" w:color="8C2A2A" w:sz="12" w:space="8"/>
+          <w:right w:val="single" w:color="8C2A2A" w:sz="12" w:space="8"/>
+        </w:pBdr>
+        <w:shd w:fill="F2EFE9" w:val="clear"/>
+        <w:spacing w:after="0" w:before="240" w:line="300"/>
+        <w:ind w:left="120" w:right="120"/>
+      </w:pPr>
+      <w:r>
+        <w:rPr>
+          <w:rFonts w:ascii="Arial" w:cs="Arial" w:eastAsia="Arial" w:hAnsi="Arial"/>
+          <w:b/>
+          <w:bCs/>
+          <w:color w:val="8C2A2A"/>
+          <w:sz w:val="22"/>
+          <w:szCs w:val="22"/>
+        </w:rPr>
+        <w:t xml:space="preserve">REPLACEMENT 6 — Requirement Documentation</w:t>
+      </w:r>
+      <w:r>
+        <w:br/>
+      </w:r>
+      <w:r>
+        <w:rPr>
+          <w:rFonts w:ascii="Arial" w:cs="Arial" w:eastAsia="Arial" w:hAnsi="Arial"/>
+          <w:color w:val="6B6B6B"/>
+          <w:sz w:val="18"/>
+          <w:szCs w:val="18"/>
+        </w:rPr>
+        <w:t xml:space="preserve">Replace the whole Requirement Documentation subsection (pages 34–36).</w:t>
+      </w:r>
+    </w:p>
     <w:p>
       <w:pPr>
         <w:spacing w:after="140" w:before="140" w:line="280"/>
@@ -3215,62 +3096,42 @@
         <w:br w:type="page"/>
       </w:r>
     </w:p>
-    <w:tbl>
-      <w:tblPr>
-        <w:tblW w:type="pct" w:w="100%"/>
-        <w:tblBorders>
-          <w:top w:val="single" w:color="8C2A2A" w:sz="12"/>
-          <w:left w:val="single" w:color="8C2A2A" w:sz="12"/>
-          <w:bottom w:val="single" w:color="8C2A2A" w:sz="12"/>
-          <w:right w:val="single" w:color="8C2A2A" w:sz="12"/>
-          <w:insideH w:val="none" w:color="FFFFFF" w:sz="0"/>
-          <w:insideV w:val="none" w:color="FFFFFF" w:sz="0"/>
-        </w:tblBorders>
-      </w:tblPr>
-      <w:tblGrid>
-        <w:gridCol w:w="100"/>
-      </w:tblGrid>
-      <w:tr>
-        <w:tc>
-          <w:tcPr>
-            <w:shd w:fill="F2EFE9" w:val="clear"/>
-            <w:tcMar>
-              <w:top w:type="dxa" w:w="140"/>
-              <w:left w:type="dxa" w:w="160"/>
-              <w:bottom w:type="dxa" w:w="140"/>
-              <w:right w:type="dxa" w:w="160"/>
-            </w:tcMar>
-          </w:tcPr>
-          <w:p>
-            <w:pPr>
-              <w:spacing w:after="40"/>
-            </w:pPr>
-            <w:r>
-              <w:rPr>
-                <w:rFonts w:ascii="Arial" w:cs="Arial" w:eastAsia="Arial" w:hAnsi="Arial"/>
-                <w:b/>
-                <w:bCs/>
-                <w:color w:val="8C2A2A"/>
-                <w:sz w:val="22"/>
-                <w:szCs w:val="22"/>
-              </w:rPr>
-              <w:t xml:space="preserve">REPLACEMENT 7 — Design of Software, System, Product and Process</w:t>
-            </w:r>
-          </w:p>
-          <w:p>
-            <w:r>
-              <w:rPr>
-                <w:rFonts w:ascii="Arial" w:cs="Arial" w:eastAsia="Arial" w:hAnsi="Arial"/>
-                <w:color w:val="6B6B6B"/>
-                <w:sz w:val="18"/>
-                <w:szCs w:val="18"/>
-              </w:rPr>
-              <w:t xml:space="preserve">Replace the whole subsection (pages 35–38), up to and including the Figure 2 caption.</w:t>
-            </w:r>
-          </w:p>
-        </w:tc>
-      </w:tr>
-    </w:tbl>
+    <w:p>
+      <w:pPr>
+        <w:pBdr>
+          <w:top w:val="single" w:color="8C2A2A" w:sz="12" w:space="8"/>
+          <w:bottom w:val="single" w:color="8C2A2A" w:sz="12" w:space="8"/>
+          <w:left w:val="single" w:color="8C2A2A" w:sz="12" w:space="8"/>
+          <w:right w:val="single" w:color="8C2A2A" w:sz="12" w:space="8"/>
+        </w:pBdr>
+        <w:shd w:fill="F2EFE9" w:val="clear"/>
+        <w:spacing w:after="0" w:before="240" w:line="300"/>
+        <w:ind w:left="120" w:right="120"/>
+      </w:pPr>
+      <w:r>
+        <w:rPr>
+          <w:rFonts w:ascii="Arial" w:cs="Arial" w:eastAsia="Arial" w:hAnsi="Arial"/>
+          <w:b/>
+          <w:bCs/>
+          <w:color w:val="8C2A2A"/>
+          <w:sz w:val="22"/>
+          <w:szCs w:val="22"/>
+        </w:rPr>
+        <w:t xml:space="preserve">REPLACEMENT 7 — Design of Software, System, Product and Process</w:t>
+      </w:r>
+      <w:r>
+        <w:br/>
+      </w:r>
+      <w:r>
+        <w:rPr>
+          <w:rFonts w:ascii="Arial" w:cs="Arial" w:eastAsia="Arial" w:hAnsi="Arial"/>
+          <w:color w:val="6B6B6B"/>
+          <w:sz w:val="18"/>
+          <w:szCs w:val="18"/>
+        </w:rPr>
+        <w:t xml:space="preserve">Replace the whole subsection (pages 35–38), up to and including the Figure 2 caption.</w:t>
+      </w:r>
+    </w:p>
     <w:p>
       <w:pPr>
         <w:spacing w:after="140" w:before="140" w:line="280"/>
@@ -3443,62 +3304,42 @@
         <w:br w:type="page"/>
       </w:r>
     </w:p>
-    <w:tbl>
-      <w:tblPr>
-        <w:tblW w:type="pct" w:w="100%"/>
-        <w:tblBorders>
-          <w:top w:val="single" w:color="8C2A2A" w:sz="12"/>
-          <w:left w:val="single" w:color="8C2A2A" w:sz="12"/>
-          <w:bottom w:val="single" w:color="8C2A2A" w:sz="12"/>
-          <w:right w:val="single" w:color="8C2A2A" w:sz="12"/>
-          <w:insideH w:val="none" w:color="FFFFFF" w:sz="0"/>
-          <w:insideV w:val="none" w:color="FFFFFF" w:sz="0"/>
-        </w:tblBorders>
-      </w:tblPr>
-      <w:tblGrid>
-        <w:gridCol w:w="100"/>
-      </w:tblGrid>
-      <w:tr>
-        <w:tc>
-          <w:tcPr>
-            <w:shd w:fill="F2EFE9" w:val="clear"/>
-            <w:tcMar>
-              <w:top w:type="dxa" w:w="140"/>
-              <w:left w:type="dxa" w:w="160"/>
-              <w:bottom w:type="dxa" w:w="140"/>
-              <w:right w:type="dxa" w:w="160"/>
-            </w:tcMar>
-          </w:tcPr>
-          <w:p>
-            <w:pPr>
-              <w:spacing w:after="40"/>
-            </w:pPr>
-            <w:r>
-              <w:rPr>
-                <w:rFonts w:ascii="Arial" w:cs="Arial" w:eastAsia="Arial" w:hAnsi="Arial"/>
-                <w:b/>
-                <w:bCs/>
-                <w:color w:val="8C2A2A"/>
-                <w:sz w:val="22"/>
-                <w:szCs w:val="22"/>
-              </w:rPr>
-              <w:t xml:space="preserve">REPLACEMENT 8 — Development and Testing</w:t>
-            </w:r>
-          </w:p>
-          <w:p>
-            <w:r>
-              <w:rPr>
-                <w:rFonts w:ascii="Arial" w:cs="Arial" w:eastAsia="Arial" w:hAnsi="Arial"/>
-                <w:color w:val="6B6B6B"/>
-                <w:sz w:val="18"/>
-                <w:szCs w:val="18"/>
-              </w:rPr>
-              <w:t xml:space="preserve">Replace the whole Development and Testing subsection (pages 38–42), from the heading through the paragraph ending "…before the final deployment." Keep the Figure 4 and Figure 5 captions where they are; both captions are reproduced below in their updated wording.</w:t>
-            </w:r>
-          </w:p>
-        </w:tc>
-      </w:tr>
-    </w:tbl>
+    <w:p>
+      <w:pPr>
+        <w:pBdr>
+          <w:top w:val="single" w:color="8C2A2A" w:sz="12" w:space="8"/>
+          <w:bottom w:val="single" w:color="8C2A2A" w:sz="12" w:space="8"/>
+          <w:left w:val="single" w:color="8C2A2A" w:sz="12" w:space="8"/>
+          <w:right w:val="single" w:color="8C2A2A" w:sz="12" w:space="8"/>
+        </w:pBdr>
+        <w:shd w:fill="F2EFE9" w:val="clear"/>
+        <w:spacing w:after="0" w:before="240" w:line="300"/>
+        <w:ind w:left="120" w:right="120"/>
+      </w:pPr>
+      <w:r>
+        <w:rPr>
+          <w:rFonts w:ascii="Arial" w:cs="Arial" w:eastAsia="Arial" w:hAnsi="Arial"/>
+          <w:b/>
+          <w:bCs/>
+          <w:color w:val="8C2A2A"/>
+          <w:sz w:val="22"/>
+          <w:szCs w:val="22"/>
+        </w:rPr>
+        <w:t xml:space="preserve">REPLACEMENT 8 — Development and Testing</w:t>
+      </w:r>
+      <w:r>
+        <w:br/>
+      </w:r>
+      <w:r>
+        <w:rPr>
+          <w:rFonts w:ascii="Arial" w:cs="Arial" w:eastAsia="Arial" w:hAnsi="Arial"/>
+          <w:color w:val="6B6B6B"/>
+          <w:sz w:val="18"/>
+          <w:szCs w:val="18"/>
+        </w:rPr>
+        <w:t xml:space="preserve">Replace the whole Development and Testing subsection (pages 38–42), from the heading through the paragraph ending "…before the final deployment." Keep the Figure 4 and Figure 5 captions where they are; both captions are reproduced below in their updated wording.</w:t>
+      </w:r>
+    </w:p>
     <w:p>
       <w:pPr>
         <w:spacing w:after="140" w:before="140" w:line="280"/>
@@ -3824,62 +3665,42 @@
         <w:br w:type="page"/>
       </w:r>
     </w:p>
-    <w:tbl>
-      <w:tblPr>
-        <w:tblW w:type="pct" w:w="100%"/>
-        <w:tblBorders>
-          <w:top w:val="single" w:color="8C2A2A" w:sz="12"/>
-          <w:left w:val="single" w:color="8C2A2A" w:sz="12"/>
-          <w:bottom w:val="single" w:color="8C2A2A" w:sz="12"/>
-          <w:right w:val="single" w:color="8C2A2A" w:sz="12"/>
-          <w:insideH w:val="none" w:color="FFFFFF" w:sz="0"/>
-          <w:insideV w:val="none" w:color="FFFFFF" w:sz="0"/>
-        </w:tblBorders>
-      </w:tblPr>
-      <w:tblGrid>
-        <w:gridCol w:w="100"/>
-      </w:tblGrid>
-      <w:tr>
-        <w:tc>
-          <w:tcPr>
-            <w:shd w:fill="F2EFE9" w:val="clear"/>
-            <w:tcMar>
-              <w:top w:type="dxa" w:w="140"/>
-              <w:left w:type="dxa" w:w="160"/>
-              <w:bottom w:type="dxa" w:w="140"/>
-              <w:right w:type="dxa" w:w="160"/>
-            </w:tcMar>
-          </w:tcPr>
-          <w:p>
-            <w:pPr>
-              <w:spacing w:after="40"/>
-            </w:pPr>
-            <w:r>
-              <w:rPr>
-                <w:rFonts w:ascii="Arial" w:cs="Arial" w:eastAsia="Arial" w:hAnsi="Arial"/>
-                <w:b/>
-                <w:bCs/>
-                <w:color w:val="8C2A2A"/>
-                <w:sz w:val="22"/>
-                <w:szCs w:val="22"/>
-              </w:rPr>
-              <w:t xml:space="preserve">REPLACEMENT 9 — Sample and Setting</w:t>
-            </w:r>
-          </w:p>
-          <w:p>
-            <w:r>
-              <w:rPr>
-                <w:rFonts w:ascii="Arial" w:cs="Arial" w:eastAsia="Arial" w:hAnsi="Arial"/>
-                <w:color w:val="6B6B6B"/>
-                <w:sz w:val="18"/>
-                <w:szCs w:val="18"/>
-              </w:rPr>
-              <w:t xml:space="preserve">Replace the whole Sample and Setting subsection (pages 41–43).</w:t>
-            </w:r>
-          </w:p>
-        </w:tc>
-      </w:tr>
-    </w:tbl>
+    <w:p>
+      <w:pPr>
+        <w:pBdr>
+          <w:top w:val="single" w:color="8C2A2A" w:sz="12" w:space="8"/>
+          <w:bottom w:val="single" w:color="8C2A2A" w:sz="12" w:space="8"/>
+          <w:left w:val="single" w:color="8C2A2A" w:sz="12" w:space="8"/>
+          <w:right w:val="single" w:color="8C2A2A" w:sz="12" w:space="8"/>
+        </w:pBdr>
+        <w:shd w:fill="F2EFE9" w:val="clear"/>
+        <w:spacing w:after="0" w:before="240" w:line="300"/>
+        <w:ind w:left="120" w:right="120"/>
+      </w:pPr>
+      <w:r>
+        <w:rPr>
+          <w:rFonts w:ascii="Arial" w:cs="Arial" w:eastAsia="Arial" w:hAnsi="Arial"/>
+          <w:b/>
+          <w:bCs/>
+          <w:color w:val="8C2A2A"/>
+          <w:sz w:val="22"/>
+          <w:szCs w:val="22"/>
+        </w:rPr>
+        <w:t xml:space="preserve">REPLACEMENT 9 — Sample and Setting</w:t>
+      </w:r>
+      <w:r>
+        <w:br/>
+      </w:r>
+      <w:r>
+        <w:rPr>
+          <w:rFonts w:ascii="Arial" w:cs="Arial" w:eastAsia="Arial" w:hAnsi="Arial"/>
+          <w:color w:val="6B6B6B"/>
+          <w:sz w:val="18"/>
+          <w:szCs w:val="18"/>
+        </w:rPr>
+        <w:t xml:space="preserve">Replace the whole Sample and Setting subsection (pages 41–43).</w:t>
+      </w:r>
+    </w:p>
     <w:p>
       <w:pPr>
         <w:spacing w:after="140" w:before="140" w:line="280"/>
@@ -4014,62 +3835,42 @@
         <w:br w:type="page"/>
       </w:r>
     </w:p>
-    <w:tbl>
-      <w:tblPr>
-        <w:tblW w:type="pct" w:w="100%"/>
-        <w:tblBorders>
-          <w:top w:val="single" w:color="8C2A2A" w:sz="12"/>
-          <w:left w:val="single" w:color="8C2A2A" w:sz="12"/>
-          <w:bottom w:val="single" w:color="8C2A2A" w:sz="12"/>
-          <w:right w:val="single" w:color="8C2A2A" w:sz="12"/>
-          <w:insideH w:val="none" w:color="FFFFFF" w:sz="0"/>
-          <w:insideV w:val="none" w:color="FFFFFF" w:sz="0"/>
-        </w:tblBorders>
-      </w:tblPr>
-      <w:tblGrid>
-        <w:gridCol w:w="100"/>
-      </w:tblGrid>
-      <w:tr>
-        <w:tc>
-          <w:tcPr>
-            <w:shd w:fill="F2EFE9" w:val="clear"/>
-            <w:tcMar>
-              <w:top w:type="dxa" w:w="140"/>
-              <w:left w:type="dxa" w:w="160"/>
-              <w:bottom w:type="dxa" w:w="140"/>
-              <w:right w:type="dxa" w:w="160"/>
-            </w:tcMar>
-          </w:tcPr>
-          <w:p>
-            <w:pPr>
-              <w:spacing w:after="40"/>
-            </w:pPr>
-            <w:r>
-              <w:rPr>
-                <w:rFonts w:ascii="Arial" w:cs="Arial" w:eastAsia="Arial" w:hAnsi="Arial"/>
-                <w:b/>
-                <w:bCs/>
-                <w:color w:val="8C2A2A"/>
-                <w:sz w:val="22"/>
-                <w:szCs w:val="22"/>
-              </w:rPr>
-              <w:t xml:space="preserve">REPLACEMENT 10 — Instrument / Simulation Tool</w:t>
-            </w:r>
-          </w:p>
-          <w:p>
-            <w:r>
-              <w:rPr>
-                <w:rFonts w:ascii="Arial" w:cs="Arial" w:eastAsia="Arial" w:hAnsi="Arial"/>
-                <w:color w:val="6B6B6B"/>
-                <w:sz w:val="18"/>
-                <w:szCs w:val="18"/>
-              </w:rPr>
-              <w:t xml:space="preserve">Replace the whole Instrument / Simulation Tool subsection (pages 42–45), including the Likert scale and interpretation lists.</w:t>
-            </w:r>
-          </w:p>
-        </w:tc>
-      </w:tr>
-    </w:tbl>
+    <w:p>
+      <w:pPr>
+        <w:pBdr>
+          <w:top w:val="single" w:color="8C2A2A" w:sz="12" w:space="8"/>
+          <w:bottom w:val="single" w:color="8C2A2A" w:sz="12" w:space="8"/>
+          <w:left w:val="single" w:color="8C2A2A" w:sz="12" w:space="8"/>
+          <w:right w:val="single" w:color="8C2A2A" w:sz="12" w:space="8"/>
+        </w:pBdr>
+        <w:shd w:fill="F2EFE9" w:val="clear"/>
+        <w:spacing w:after="0" w:before="240" w:line="300"/>
+        <w:ind w:left="120" w:right="120"/>
+      </w:pPr>
+      <w:r>
+        <w:rPr>
+          <w:rFonts w:ascii="Arial" w:cs="Arial" w:eastAsia="Arial" w:hAnsi="Arial"/>
+          <w:b/>
+          <w:bCs/>
+          <w:color w:val="8C2A2A"/>
+          <w:sz w:val="22"/>
+          <w:szCs w:val="22"/>
+        </w:rPr>
+        <w:t xml:space="preserve">REPLACEMENT 10 — Instrument / Simulation Tool</w:t>
+      </w:r>
+      <w:r>
+        <w:br/>
+      </w:r>
+      <w:r>
+        <w:rPr>
+          <w:rFonts w:ascii="Arial" w:cs="Arial" w:eastAsia="Arial" w:hAnsi="Arial"/>
+          <w:color w:val="6B6B6B"/>
+          <w:sz w:val="18"/>
+          <w:szCs w:val="18"/>
+        </w:rPr>
+        <w:t xml:space="preserve">Replace the whole Instrument / Simulation Tool subsection (pages 42–45), including the Likert scale and interpretation lists.</w:t>
+      </w:r>
+    </w:p>
     <w:p>
       <w:pPr>
         <w:spacing w:after="140" w:before="140" w:line="280"/>
@@ -4420,62 +4221,42 @@
         <w:br w:type="page"/>
       </w:r>
     </w:p>
-    <w:tbl>
-      <w:tblPr>
-        <w:tblW w:type="pct" w:w="100%"/>
-        <w:tblBorders>
-          <w:top w:val="single" w:color="8C2A2A" w:sz="12"/>
-          <w:left w:val="single" w:color="8C2A2A" w:sz="12"/>
-          <w:bottom w:val="single" w:color="8C2A2A" w:sz="12"/>
-          <w:right w:val="single" w:color="8C2A2A" w:sz="12"/>
-          <w:insideH w:val="none" w:color="FFFFFF" w:sz="0"/>
-          <w:insideV w:val="none" w:color="FFFFFF" w:sz="0"/>
-        </w:tblBorders>
-      </w:tblPr>
-      <w:tblGrid>
-        <w:gridCol w:w="100"/>
-      </w:tblGrid>
-      <w:tr>
-        <w:tc>
-          <w:tcPr>
-            <w:shd w:fill="F2EFE9" w:val="clear"/>
-            <w:tcMar>
-              <w:top w:type="dxa" w:w="140"/>
-              <w:left w:type="dxa" w:w="160"/>
-              <w:bottom w:type="dxa" w:w="140"/>
-              <w:right w:type="dxa" w:w="160"/>
-            </w:tcMar>
-          </w:tcPr>
-          <w:p>
-            <w:pPr>
-              <w:spacing w:after="40"/>
-            </w:pPr>
-            <w:r>
-              <w:rPr>
-                <w:rFonts w:ascii="Arial" w:cs="Arial" w:eastAsia="Arial" w:hAnsi="Arial"/>
-                <w:b/>
-                <w:bCs/>
-                <w:color w:val="8C2A2A"/>
-                <w:sz w:val="22"/>
-                <w:szCs w:val="22"/>
-              </w:rPr>
-              <w:t xml:space="preserve">REPLACEMENT 11 — Ethical Consideration</w:t>
-            </w:r>
-          </w:p>
-          <w:p>
-            <w:r>
-              <w:rPr>
-                <w:rFonts w:ascii="Arial" w:cs="Arial" w:eastAsia="Arial" w:hAnsi="Arial"/>
-                <w:color w:val="6B6B6B"/>
-                <w:sz w:val="18"/>
-                <w:szCs w:val="18"/>
-              </w:rPr>
-              <w:t xml:space="preserve">Replace the whole Ethical Consideration subsection (pages 44–47).</w:t>
-            </w:r>
-          </w:p>
-        </w:tc>
-      </w:tr>
-    </w:tbl>
+    <w:p>
+      <w:pPr>
+        <w:pBdr>
+          <w:top w:val="single" w:color="8C2A2A" w:sz="12" w:space="8"/>
+          <w:bottom w:val="single" w:color="8C2A2A" w:sz="12" w:space="8"/>
+          <w:left w:val="single" w:color="8C2A2A" w:sz="12" w:space="8"/>
+          <w:right w:val="single" w:color="8C2A2A" w:sz="12" w:space="8"/>
+        </w:pBdr>
+        <w:shd w:fill="F2EFE9" w:val="clear"/>
+        <w:spacing w:after="0" w:before="240" w:line="300"/>
+        <w:ind w:left="120" w:right="120"/>
+      </w:pPr>
+      <w:r>
+        <w:rPr>
+          <w:rFonts w:ascii="Arial" w:cs="Arial" w:eastAsia="Arial" w:hAnsi="Arial"/>
+          <w:b/>
+          <w:bCs/>
+          <w:color w:val="8C2A2A"/>
+          <w:sz w:val="22"/>
+          <w:szCs w:val="22"/>
+        </w:rPr>
+        <w:t xml:space="preserve">REPLACEMENT 11 — Ethical Consideration</w:t>
+      </w:r>
+      <w:r>
+        <w:br/>
+      </w:r>
+      <w:r>
+        <w:rPr>
+          <w:rFonts w:ascii="Arial" w:cs="Arial" w:eastAsia="Arial" w:hAnsi="Arial"/>
+          <w:color w:val="6B6B6B"/>
+          <w:sz w:val="18"/>
+          <w:szCs w:val="18"/>
+        </w:rPr>
+        <w:t xml:space="preserve">Replace the whole Ethical Consideration subsection (pages 44–47).</w:t>
+      </w:r>
+    </w:p>
     <w:p>
       <w:pPr>
         <w:spacing w:after="140" w:before="140" w:line="280"/>
@@ -4642,81 +4423,61 @@
         <w:br w:type="page"/>
       </w:r>
     </w:p>
+    <w:p>
+      <w:pPr>
+        <w:pBdr>
+          <w:top w:val="single" w:color="8C2A2A" w:sz="12" w:space="8"/>
+          <w:bottom w:val="single" w:color="8C2A2A" w:sz="12" w:space="8"/>
+          <w:left w:val="single" w:color="8C2A2A" w:sz="12" w:space="8"/>
+          <w:right w:val="single" w:color="8C2A2A" w:sz="12" w:space="8"/>
+        </w:pBdr>
+        <w:shd w:fill="F2EFE9" w:val="clear"/>
+        <w:spacing w:after="0" w:before="240" w:line="300"/>
+        <w:ind w:left="120" w:right="120"/>
+      </w:pPr>
+      <w:r>
+        <w:rPr>
+          <w:rFonts w:ascii="Arial" w:cs="Arial" w:eastAsia="Arial" w:hAnsi="Arial"/>
+          <w:b/>
+          <w:bCs/>
+          <w:color w:val="8C2A2A"/>
+          <w:sz w:val="22"/>
+          <w:szCs w:val="22"/>
+        </w:rPr>
+        <w:t xml:space="preserve">REPLACEMENT 12 — Small edits elsewhere</w:t>
+      </w:r>
+      <w:r>
+        <w:br/>
+      </w:r>
+      <w:r>
+        <w:rPr>
+          <w:rFonts w:ascii="Arial" w:cs="Arial" w:eastAsia="Arial" w:hAnsi="Arial"/>
+          <w:color w:val="6B6B6B"/>
+          <w:sz w:val="18"/>
+          <w:szCs w:val="18"/>
+        </w:rPr>
+        <w:t xml:space="preserve">These are single-line changes; they are not worth replacing a whole section for.</w:t>
+      </w:r>
+    </w:p>
+    <w:p>
+      <w:pPr>
+        <w:spacing w:after="120" w:line="280"/>
+      </w:pPr>
+      <w:r>
+        <w:rPr>
+          <w:rFonts w:ascii="Arial" w:cs="Arial" w:eastAsia="Arial" w:hAnsi="Arial"/>
+          <w:b w:val="false"/>
+          <w:bCs w:val="false"/>
+          <w:color w:val="1A1A1A"/>
+          <w:sz w:val="19"/>
+          <w:szCs w:val="19"/>
+        </w:rPr>
+        <w:t xml:space="preserve"/>
+      </w:r>
+    </w:p>
     <w:tbl>
       <w:tblPr>
-        <w:tblW w:type="pct" w:w="100%"/>
-        <w:tblBorders>
-          <w:top w:val="single" w:color="8C2A2A" w:sz="12"/>
-          <w:left w:val="single" w:color="8C2A2A" w:sz="12"/>
-          <w:bottom w:val="single" w:color="8C2A2A" w:sz="12"/>
-          <w:right w:val="single" w:color="8C2A2A" w:sz="12"/>
-          <w:insideH w:val="none" w:color="FFFFFF" w:sz="0"/>
-          <w:insideV w:val="none" w:color="FFFFFF" w:sz="0"/>
-        </w:tblBorders>
-      </w:tblPr>
-      <w:tblGrid>
-        <w:gridCol w:w="100"/>
-      </w:tblGrid>
-      <w:tr>
-        <w:tc>
-          <w:tcPr>
-            <w:shd w:fill="F2EFE9" w:val="clear"/>
-            <w:tcMar>
-              <w:top w:type="dxa" w:w="140"/>
-              <w:left w:type="dxa" w:w="160"/>
-              <w:bottom w:type="dxa" w:w="140"/>
-              <w:right w:type="dxa" w:w="160"/>
-            </w:tcMar>
-          </w:tcPr>
-          <w:p>
-            <w:pPr>
-              <w:spacing w:after="40"/>
-            </w:pPr>
-            <w:r>
-              <w:rPr>
-                <w:rFonts w:ascii="Arial" w:cs="Arial" w:eastAsia="Arial" w:hAnsi="Arial"/>
-                <w:b/>
-                <w:bCs/>
-                <w:color w:val="8C2A2A"/>
-                <w:sz w:val="22"/>
-                <w:szCs w:val="22"/>
-              </w:rPr>
-              <w:t xml:space="preserve">REPLACEMENT 12 — Small edits elsewhere</w:t>
-            </w:r>
-          </w:p>
-          <w:p>
-            <w:r>
-              <w:rPr>
-                <w:rFonts w:ascii="Arial" w:cs="Arial" w:eastAsia="Arial" w:hAnsi="Arial"/>
-                <w:color w:val="6B6B6B"/>
-                <w:sz w:val="18"/>
-                <w:szCs w:val="18"/>
-              </w:rPr>
-              <w:t xml:space="preserve">These are single-line changes; they are not worth replacing a whole section for.</w:t>
-            </w:r>
-          </w:p>
-        </w:tc>
-      </w:tr>
-    </w:tbl>
-    <w:p>
-      <w:pPr>
-        <w:spacing w:after="120" w:line="280"/>
-      </w:pPr>
-      <w:r>
-        <w:rPr>
-          <w:rFonts w:ascii="Arial" w:cs="Arial" w:eastAsia="Arial" w:hAnsi="Arial"/>
-          <w:b w:val="false"/>
-          <w:bCs w:val="false"/>
-          <w:color w:val="1A1A1A"/>
-          <w:sz w:val="19"/>
-          <w:szCs w:val="19"/>
-        </w:rPr>
-        <w:t xml:space="preserve"/>
-      </w:r>
-    </w:p>
-    <w:tbl>
-      <w:tblPr>
-        <w:tblW w:type="pct" w:w="100%"/>
+        <w:tblW w:type="dxa" w:w="9360"/>
         <w:tblBorders>
           <w:top w:val="single" w:color="C9C2B6" w:sz="4"/>
           <w:left w:val="single" w:color="C9C2B6" w:sz="4"/>
@@ -4725,11 +4486,12 @@
           <w:insideH w:val="single" w:color="DDD6C9" w:sz="2"/>
           <w:insideV w:val="single" w:color="DDD6C9" w:sz="2"/>
         </w:tblBorders>
+        <w:tblLayout w:type="fixed"/>
       </w:tblPr>
       <w:tblGrid>
-        <w:gridCol w:w="100"/>
-        <w:gridCol w:w="100"/>
-        <w:gridCol w:w="100"/>
+        <w:gridCol w:w="1685"/>
+        <w:gridCol w:w="3744"/>
+        <w:gridCol w:w="3931"/>
       </w:tblGrid>
       <w:tr>
         <w:trPr>
@@ -4737,7 +4499,7 @@
         </w:trPr>
         <w:tc>
           <w:tcPr>
-            <w:tcW w:type="pct" w:w="18%"/>
+            <w:tcW w:type="dxa" w:w="1685"/>
             <w:shd w:fill="F2EFE9" w:val="clear"/>
             <w:tcMar>
               <w:top w:type="dxa" w:w="90"/>
@@ -4765,7 +4527,7 @@
         </w:tc>
         <w:tc>
           <w:tcPr>
-            <w:tcW w:type="pct" w:w="40%"/>
+            <w:tcW w:type="dxa" w:w="3744"/>
             <w:shd w:fill="F2EFE9" w:val="clear"/>
             <w:tcMar>
               <w:top w:type="dxa" w:w="90"/>
@@ -4793,7 +4555,7 @@
         </w:tc>
         <w:tc>
           <w:tcPr>
-            <w:tcW w:type="pct" w:w="42%"/>
+            <w:tcW w:type="dxa" w:w="3931"/>
             <w:shd w:fill="F2EFE9" w:val="clear"/>
             <w:tcMar>
               <w:top w:type="dxa" w:w="90"/>
@@ -4823,7 +4585,7 @@
       <w:tr>
         <w:tc>
           <w:tcPr>
-            <w:tcW w:type="pct" w:w="18%"/>
+            <w:tcW w:type="dxa" w:w="1685"/>
             <w:tcMar>
               <w:top w:type="dxa" w:w="90"/>
               <w:left w:type="dxa" w:w="120"/>
@@ -4850,7 +4612,7 @@
         </w:tc>
         <w:tc>
           <w:tcPr>
-            <w:tcW w:type="pct" w:w="40%"/>
+            <w:tcW w:type="dxa" w:w="3744"/>
             <w:tcMar>
               <w:top w:type="dxa" w:w="90"/>
               <w:left w:type="dxa" w:w="120"/>
@@ -4877,7 +4639,7 @@
         </w:tc>
         <w:tc>
           <w:tcPr>
-            <w:tcW w:type="pct" w:w="42%"/>
+            <w:tcW w:type="dxa" w:w="3931"/>
             <w:tcMar>
               <w:top w:type="dxa" w:w="90"/>
               <w:left w:type="dxa" w:w="120"/>
@@ -4906,7 +4668,7 @@
       <w:tr>
         <w:tc>
           <w:tcPr>
-            <w:tcW w:type="pct" w:w="18%"/>
+            <w:tcW w:type="dxa" w:w="1685"/>
             <w:tcMar>
               <w:top w:type="dxa" w:w="90"/>
               <w:left w:type="dxa" w:w="120"/>
@@ -4933,7 +4695,7 @@
         </w:tc>
         <w:tc>
           <w:tcPr>
-            <w:tcW w:type="pct" w:w="40%"/>
+            <w:tcW w:type="dxa" w:w="3744"/>
             <w:tcMar>
               <w:top w:type="dxa" w:w="90"/>
               <w:left w:type="dxa" w:w="120"/>
@@ -4960,7 +4722,7 @@
         </w:tc>
         <w:tc>
           <w:tcPr>
-            <w:tcW w:type="pct" w:w="42%"/>
+            <w:tcW w:type="dxa" w:w="3931"/>
             <w:tcMar>
               <w:top w:type="dxa" w:w="90"/>
               <w:left w:type="dxa" w:w="120"/>
@@ -4989,7 +4751,7 @@
       <w:tr>
         <w:tc>
           <w:tcPr>
-            <w:tcW w:type="pct" w:w="18%"/>
+            <w:tcW w:type="dxa" w:w="1685"/>
             <w:tcMar>
               <w:top w:type="dxa" w:w="90"/>
               <w:left w:type="dxa" w:w="120"/>
@@ -5016,7 +4778,7 @@
         </w:tc>
         <w:tc>
           <w:tcPr>
-            <w:tcW w:type="pct" w:w="40%"/>
+            <w:tcW w:type="dxa" w:w="3744"/>
             <w:tcMar>
               <w:top w:type="dxa" w:w="90"/>
               <w:left w:type="dxa" w:w="120"/>
@@ -5043,7 +4805,7 @@
         </w:tc>
         <w:tc>
           <w:tcPr>
-            <w:tcW w:type="pct" w:w="42%"/>
+            <w:tcW w:type="dxa" w:w="3931"/>
             <w:tcMar>
               <w:top w:type="dxa" w:w="90"/>
               <w:left w:type="dxa" w:w="120"/>
@@ -5072,7 +4834,7 @@
       <w:tr>
         <w:tc>
           <w:tcPr>
-            <w:tcW w:type="pct" w:w="18%"/>
+            <w:tcW w:type="dxa" w:w="1685"/>
             <w:tcMar>
               <w:top w:type="dxa" w:w="90"/>
               <w:left w:type="dxa" w:w="120"/>
@@ -5099,7 +4861,7 @@
         </w:tc>
         <w:tc>
           <w:tcPr>
-            <w:tcW w:type="pct" w:w="40%"/>
+            <w:tcW w:type="dxa" w:w="3744"/>
             <w:tcMar>
               <w:top w:type="dxa" w:w="90"/>
               <w:left w:type="dxa" w:w="120"/>
@@ -5126,7 +4888,7 @@
         </w:tc>
         <w:tc>
           <w:tcPr>
-            <w:tcW w:type="pct" w:w="42%"/>
+            <w:tcW w:type="dxa" w:w="3931"/>
             <w:tcMar>
               <w:top w:type="dxa" w:w="90"/>
               <w:left w:type="dxa" w:w="120"/>
@@ -5155,7 +4917,7 @@
       <w:tr>
         <w:tc>
           <w:tcPr>
-            <w:tcW w:type="pct" w:w="18%"/>
+            <w:tcW w:type="dxa" w:w="1685"/>
             <w:tcMar>
               <w:top w:type="dxa" w:w="90"/>
               <w:left w:type="dxa" w:w="120"/>
@@ -5182,7 +4944,7 @@
         </w:tc>
         <w:tc>
           <w:tcPr>
-            <w:tcW w:type="pct" w:w="40%"/>
+            <w:tcW w:type="dxa" w:w="3744"/>
             <w:tcMar>
               <w:top w:type="dxa" w:w="90"/>
               <w:left w:type="dxa" w:w="120"/>
@@ -5209,7 +4971,7 @@
         </w:tc>
         <w:tc>
           <w:tcPr>
-            <w:tcW w:type="pct" w:w="42%"/>
+            <w:tcW w:type="dxa" w:w="3931"/>
             <w:tcMar>
               <w:top w:type="dxa" w:w="90"/>
               <w:left w:type="dxa" w:w="120"/>
@@ -5238,7 +5000,7 @@
       <w:tr>
         <w:tc>
           <w:tcPr>
-            <w:tcW w:type="pct" w:w="18%"/>
+            <w:tcW w:type="dxa" w:w="1685"/>
             <w:tcMar>
               <w:top w:type="dxa" w:w="90"/>
               <w:left w:type="dxa" w:w="120"/>
@@ -5265,7 +5027,7 @@
         </w:tc>
         <w:tc>
           <w:tcPr>
-            <w:tcW w:type="pct" w:w="40%"/>
+            <w:tcW w:type="dxa" w:w="3744"/>
             <w:tcMar>
               <w:top w:type="dxa" w:w="90"/>
               <w:left w:type="dxa" w:w="120"/>
@@ -5292,7 +5054,7 @@
         </w:tc>
         <w:tc>
           <w:tcPr>
-            <w:tcW w:type="pct" w:w="42%"/>
+            <w:tcW w:type="dxa" w:w="3931"/>
             <w:tcMar>
               <w:top w:type="dxa" w:w="90"/>
               <w:left w:type="dxa" w:w="120"/>
@@ -5321,7 +5083,7 @@
       <w:tr>
         <w:tc>
           <w:tcPr>
-            <w:tcW w:type="pct" w:w="18%"/>
+            <w:tcW w:type="dxa" w:w="1685"/>
             <w:tcMar>
               <w:top w:type="dxa" w:w="90"/>
               <w:left w:type="dxa" w:w="120"/>
@@ -5348,7 +5110,7 @@
         </w:tc>
         <w:tc>
           <w:tcPr>
-            <w:tcW w:type="pct" w:w="40%"/>
+            <w:tcW w:type="dxa" w:w="3744"/>
             <w:tcMar>
               <w:top w:type="dxa" w:w="90"/>
               <w:left w:type="dxa" w:w="120"/>
@@ -5375,7 +5137,7 @@
         </w:tc>
         <w:tc>
           <w:tcPr>
-            <w:tcW w:type="pct" w:w="42%"/>
+            <w:tcW w:type="dxa" w:w="3931"/>
             <w:tcMar>
               <w:top w:type="dxa" w:w="90"/>
               <w:left w:type="dxa" w:w="120"/>

</xml_diff>

<commit_message>
docs: refresh the manuscript revisions with the current test figures
The replacement text still described 29 engine + 16 API tests. Development
and Testing now describes the four suites as built — 30 engine, 26 API, 10
email delivery, 10 resume extraction, 76 in total — plus the two browser
walkthroughs, which is a level of verification the section did not mention
at all. The Objectives, Scope and Conceptual Framework blocks that name the
testing approach were updated to match.

Co-Authored-By: Claude Opus 5 <noreply@anthropic.com>
Claude-Session: https://claude.ai/code/session_01KJCBhwXyDj1kaiQWF9G7ZP
</commit_message>
<xml_diff>
--- a/05_Website_Angular/docs/ResumeMatch-PH-Updated-Manuscript-Sections.docx
+++ b/05_Website_Angular/docs/ResumeMatch-PH-Updated-Manuscript-Sections.docx
@@ -1072,7 +1072,7 @@
                 <w:sz w:val="17"/>
                 <w:szCs w:val="17"/>
               </w:rPr>
-              <w:t xml:space="preserve">Two automated suites also run on every code change: 29 matching-engine tests and 16 API integration tests, under a continuous-integration workflow.</w:t>
+              <w:t xml:space="preserve">Four automated suites (76 tests) and two browser walkthroughs (24 checks) also run before the ISO 25010 evaluation; the four suites run on every code change under continuous integration.</w:t>
             </w:r>
           </w:p>
         </w:tc>
@@ -1644,7 +1644,7 @@
           <w:sz w:val="24"/>
           <w:szCs w:val="24"/>
         </w:rPr>
-        <w:t xml:space="preserve">The Process section shows how the system will be built and developed. It follows five phases. The first phase is planning and requirements, where the researchers identify the needs of the two primary user groups — job seekers and recruiters — and define the system requirements. The second phase is system design, where the UI/UX design, the database architecture for user, resume, company, job posting, and application data, and the design of the matching algorithm are planned out. The third phase is development, where the resume builder, the job posting and application modules, the ATS-inspired matching engine, the administrative module, and the recruiter dashboard are coded and integrated. The fourth phase is testing and quality assurance, where the system undergoes automated regression testing of the matching engine and the application programming interface, functionality testing, usability testing, and ISO 25010 evaluation. The fifth and final phase is deployment, where the system is launched, user onboarding is conducted, and user acceptance testing is carried out with both job seekers and HR personnel.</w:t>
+        <w:t xml:space="preserve">The Process section shows how the system will be built and developed. It follows five phases. The first phase is planning and requirements, where the researchers identify the needs of the two primary user groups — job seekers and recruiters — and define the system requirements. The second phase is system design, where the UI/UX design, the database architecture for user, resume, company, job posting, and application data, and the design of the matching algorithm are planned out. The third phase is development, where the resume builder, the job posting and application modules, the ATS-inspired matching engine, the administrative module, and the recruiter dashboard are coded and integrated. The fourth phase is testing and quality assurance, where the system undergoes automated regression testing of the matching engine, the application programming interface, email delivery, and the resume-extraction feature, browser walkthroughs of the complete interface, functionality testing, usability testing, and ISO 25010 evaluation. The fifth and final phase is deployment, where the system is launched, user onboarding is conducted, and user acceptance testing is carried out with both job seekers and HR personnel.</w:t>
       </w:r>
     </w:p>
     <w:p>
@@ -2033,7 +2033,7 @@
           <w:sz w:val="24"/>
           <w:szCs w:val="24"/>
         </w:rPr>
-        <w:t xml:space="preserve">To test and evaluate the system using automated regression tests for the matching engine and the application programming interface, and using the ISO 25010 standard — specifically in terms of usability, functionality, and reliability — based on feedback from actual job seekers and HR personnel.</w:t>
+        <w:t xml:space="preserve">To test and evaluate the system using automated regression tests covering the matching engine, the application programming interface, email delivery, and the resume-extraction feature, together with browser walkthroughs of the complete interface, and using the ISO 25010 standard — specifically in terms of usability, functionality, and reliability — based on feedback from actual job seekers and HR personnel.</w:t>
       </w:r>
     </w:p>
     <w:p>
@@ -2468,7 +2468,7 @@
           <w:sz w:val="24"/>
           <w:szCs w:val="24"/>
         </w:rPr>
-        <w:t xml:space="preserve">The evaluation of the system using the ISO 25010 quality model in terms of usability, functionality, and reliability based on feedback from job seeker and HR respondents, supported by automated regression tests of the matching engine and the application programming interface.</w:t>
+        <w:t xml:space="preserve">The evaluation of the system using the ISO 25010 quality model in terms of usability, functionality, and reliability based on feedback from job seeker and HR respondents, supported by automated regression tests of the matching engine, the application programming interface, email delivery, and the resume-extraction feature, and by browser walkthroughs of the complete interface.</w:t>
       </w:r>
     </w:p>
     <w:p>
@@ -3638,7 +3638,39 @@
           <w:sz w:val="24"/>
           <w:szCs w:val="24"/>
         </w:rPr>
-        <w:t xml:space="preserve">The system is verified at three levels. First, an automated regression suite of 29 tests covers the matching engine. It checks the weighting of each component, the boundaries of the three tiers, the treatment of unspecified requirements, and the rounding rule; it includes a randomised sweep of 500 generated resume-and-posting pairs confirming that the browser implementation and the server implementation of the scoring function agree exactly; and it includes tests confirming that the skill vocabulary never equates two genuinely different skills. Second, an automated integration suite of 16 tests starts the real server against a temporary PostgreSQL database and drives it over HTTP, verifying registration and sign-in, role-based access control, the rule that one applicant cannot read or modify another applicant's resume, the rule that a recruiter only ever sees applications belonging to their own company, the prevention of duplicate applications to the same posting, the conditions under which an application may be withdrawn, and the guarantee that an applicant's uploaded file never takes part in producing a score. Both suites run automatically on every change to the source code through a continuous integration workflow that also builds the front end and type-checks the server, so that a regression is detected before it can reach the deployed system. Third, the completed system is evaluated with actual users using the ISO 25010 standard, focusing on usability, functionality, and reliability. User acceptance testing will be done with both target user groups — job seekers and HR personnel — to check whether the system is effective for each of them and to gather feedback before the final deployment.</w:t>
+        <w:t xml:space="preserve">The system is verified at three levels. The first is automated regression testing, which covers four areas and runs in full on every change to the source code. Thirty tests cover the matching engine: the weighting of each component, the boundaries of the three tiers, the treatment of unspecified requirements, the rounding rule, a randomised sweep of 500 generated resume-and-posting pairs confirming that the browser and the server implementations of the scoring function agree exactly, and checks confirming that the skill vocabulary never equates two genuinely different skills. Twenty-six tests start the real server against a temporary PostgreSQL database and drive it over HTTP, verifying registration and sign-in, role-based access control, the rule that one applicant cannot read or modify another applicant's resume, the rule that a recruiter only ever sees applications belonging to their own company, the prevention of duplicate applications to the same posting, the conditions under which an application may be withdrawn, and the guarantee that an applicant's uploaded file never takes part in producing a score. Ten tests confirm that every message the system sends is actually delivered — verification and password-reset codes, the recruiter's new-application notice, status changes, job alerts, and interview invitations — by receiving them from a local mail server, and confirm that nothing is sent to an applicant who has switched notifications off or to an address with no account. A further ten tests cover the optional resume-extraction feature against a local stand-in for the language model service, confirming above all that the model's output is treated as untrusted: a malformed or hostile reply cannot place unbounded text, invalid education levels, or implausible quantities into an applicant's resume, and no score is ever returned from that route. Seventy-six automated tests run in total, through a continuous integration workflow that also builds the front end and type-checks the server, so that a regression is detected before it can reach the deployed system.</w:t>
+      </w:r>
+    </w:p>
+    <w:p>
+      <w:pPr>
+        <w:spacing w:after="0" w:line="480"/>
+        <w:ind w:firstLine="720"/>
+        <w:jc w:val="both"/>
+      </w:pPr>
+      <w:r>
+        <w:rPr>
+          <w:rFonts w:ascii="Times New Roman" w:cs="Times New Roman" w:eastAsia="Times New Roman" w:hAnsi="Times New Roman"/>
+          <w:color w:val="1A1A1A"/>
+          <w:sz w:val="24"/>
+          <w:szCs w:val="24"/>
+        </w:rPr>
+        <w:t xml:space="preserve">The second level is a browser walkthrough. Two scripted runs drive the complete interface in a real browser the way a user would — all three account types, every page, the resume builder and its design choices, applying to an opening, the recruiter's ranked applicant list, the file upload and its limits, the light and dark display modes, and the layout at a 390-pixel phone width — and they fail on any error the browser reports. These catch what unit tests cannot: a page that renders blank, or a control that silently stops working.</w:t>
+      </w:r>
+    </w:p>
+    <w:p>
+      <w:pPr>
+        <w:spacing w:after="0" w:line="480"/>
+        <w:ind w:firstLine="720"/>
+        <w:jc w:val="both"/>
+      </w:pPr>
+      <w:r>
+        <w:rPr>
+          <w:rFonts w:ascii="Times New Roman" w:cs="Times New Roman" w:eastAsia="Times New Roman" w:hAnsi="Times New Roman"/>
+          <w:color w:val="1A1A1A"/>
+          <w:sz w:val="24"/>
+          <w:szCs w:val="24"/>
+        </w:rPr>
+        <w:t xml:space="preserve">The third level is evaluation with actual users. The completed system is assessed using the ISO 25010 standard, focusing on usability, functionality, and reliability. User acceptance testing will be done with both target user groups — job seekers and HR personnel — to check whether the system is effective for each of them and to gather feedback before the final deployment.</w:t>
       </w:r>
     </w:p>
     <w:p>

</xml_diff>